<commit_message>
feat: Fully AI working as MVP
</commit_message>
<xml_diff>
--- a/documents/loan_application_twitezimbere_gasabo.docx
+++ b/documents/loan_application_twitezimbere_gasabo.docx
@@ -4,6 +4,7 @@
   <w:body>
     <w:p>
       <w:pPr>
+        <w:ind w:firstLine="720"/>
         <w:jc w:val="center"/>
       </w:pPr>
       <w:r>
@@ -107,13 +108,7 @@
               <w:rPr>
                 <w:sz w:val="19"/>
               </w:rPr>
-              <w:t xml:space="preserve">Koperative </w:t>
-            </w:r>
-            <w:r>
-              <w:rPr>
-                <w:sz w:val="19"/>
-              </w:rPr>
-              <w:t>Twitezimbere Gasabo</w:t>
+              <w:t>Koperative Twitezimbere Gasabo</w:t>
             </w:r>
           </w:p>
         </w:tc>
@@ -253,14 +248,7 @@
                 <w:b/>
                 <w:sz w:val="19"/>
               </w:rPr>
-              <w:t>Year Established / Operati</w:t>
-            </w:r>
-            <w:r>
-              <w:rPr>
-                <w:b/>
-                <w:sz w:val="19"/>
-              </w:rPr>
-              <w:t>ng Experience</w:t>
+              <w:t>Year Established / Operating Experience</w:t>
             </w:r>
           </w:p>
         </w:tc>
@@ -391,7 +379,7 @@
               <w:rPr>
                 <w:sz w:val="19"/>
               </w:rPr>
-              <w:t>80</w:t>
+              <w:t>10</w:t>
             </w:r>
             <w:r>
               <w:rPr>
@@ -403,7 +391,21 @@
               <w:rPr>
                 <w:sz w:val="19"/>
               </w:rPr>
-              <w:t xml:space="preserve">(Eighty </w:t>
+              <w:t>(</w:t>
+            </w:r>
+            <w:r>
+              <w:rPr>
+                <w:sz w:val="19"/>
+              </w:rPr>
+              <w:t>Ten</w:t>
+            </w:r>
+            <w:bookmarkStart w:id="0" w:name="_GoBack"/>
+            <w:bookmarkEnd w:id="0"/>
+            <w:r>
+              <w:rPr>
+                <w:sz w:val="19"/>
+              </w:rPr>
+              <w:t xml:space="preserve"> </w:t>
             </w:r>
             <w:r>
               <w:rPr>
@@ -415,25 +417,7 @@
               <w:rPr>
                 <w:sz w:val="19"/>
               </w:rPr>
-              <w:t>M</w:t>
-            </w:r>
-            <w:r>
-              <w:rPr>
-                <w:sz w:val="19"/>
-              </w:rPr>
-              <w:t>i</w:t>
-            </w:r>
-            <w:r>
-              <w:rPr>
-                <w:sz w:val="19"/>
-              </w:rPr>
-              <w:t>l</w:t>
-            </w:r>
-            <w:r>
-              <w:rPr>
-                <w:sz w:val="19"/>
-              </w:rPr>
-              <w:t>lion Rwandan Francs)</w:t>
+              <w:t>Million Rwandan Francs)</w:t>
             </w:r>
           </w:p>
         </w:tc>
@@ -511,15 +495,7 @@
               <w:rPr>
                 <w:sz w:val="19"/>
               </w:rPr>
-              <w:t>Season 2026A (Planting &amp; Harve</w:t>
-            </w:r>
-            <w:bookmarkStart w:id="0" w:name="_GoBack"/>
-            <w:bookmarkEnd w:id="0"/>
-            <w:r>
-              <w:rPr>
-                <w:sz w:val="19"/>
-              </w:rPr>
-              <w:t>st Aggregation Cycle)</w:t>
+              <w:t>Season 2026A (Planting &amp; Harvest Aggregation Cycle)</w:t>
             </w:r>
           </w:p>
         </w:tc>
@@ -558,13 +534,7 @@
               <w:rPr>
                 <w:sz w:val="19"/>
               </w:rPr>
-              <w:t>6 Months (Disbursement in March 2026, Bulle</w:t>
-            </w:r>
-            <w:r>
-              <w:rPr>
-                <w:sz w:val="19"/>
-              </w:rPr>
-              <w:t>t Settlement August 2026)</w:t>
+              <w:t>6 Months (Disbursement in March 2026, Bullet Settlement August 2026)</w:t>
             </w:r>
           </w:p>
         </w:tc>
@@ -642,13 +612,7 @@
               <w:rPr>
                 <w:sz w:val="19"/>
               </w:rPr>
-              <w:t>Bulk procurement of certified hybrid maize seed, subsidized NPK/DAP fertilizers, farmer aggregation cash sweeps, post-harvest drying,</w:t>
-            </w:r>
-            <w:r>
-              <w:rPr>
-                <w:sz w:val="19"/>
-              </w:rPr>
-              <w:t xml:space="preserve"> and warehouse delivery under off-take contract.</w:t>
+              <w:t>Bulk procurement of certified hybrid maize seed, subsidized NPK/DAP fertilizers, farmer aggregation cash sweeps, post-harvest drying, and warehouse delivery under off-take contract.</w:t>
             </w:r>
           </w:p>
         </w:tc>
@@ -754,13 +718,7 @@
               <w:rPr>
                 <w:sz w:val="19"/>
               </w:rPr>
-              <w:t xml:space="preserve">120 Metric </w:t>
-            </w:r>
-            <w:r>
-              <w:rPr>
-                <w:sz w:val="19"/>
-              </w:rPr>
-              <w:t>Tons dedicated aerated brick warehouse with moisture meters</w:t>
+              <w:t>120 Metric Tons dedicated aerated brick warehouse with moisture meters</w:t>
             </w:r>
           </w:p>
         </w:tc>
@@ -861,14 +819,7 @@
                 <w:b/>
                 <w:sz w:val="19"/>
               </w:rPr>
-              <w:t>P</w:t>
-            </w:r>
-            <w:r>
-              <w:rPr>
-                <w:b/>
-                <w:sz w:val="19"/>
-              </w:rPr>
-              <w:t>rimary Forward Off-Take Partner</w:t>
+              <w:t>Primary Forward Off-Take Partner</w:t>
             </w:r>
           </w:p>
         </w:tc>
@@ -896,19 +847,7 @@
               <w:rPr>
                 <w:sz w:val="19"/>
               </w:rPr>
-              <w:t>0</w:t>
-            </w:r>
-            <w:r>
-              <w:rPr>
-                <w:sz w:val="19"/>
-              </w:rPr>
-              <w:t>0</w:t>
-            </w:r>
-            <w:r>
-              <w:rPr>
-                <w:sz w:val="19"/>
-              </w:rPr>
-              <w:t xml:space="preserve">,000 KG at RWF 420/KG = RWF </w:t>
+              <w:t xml:space="preserve">00,000 KG at RWF 420/KG = RWF </w:t>
             </w:r>
             <w:r>
               <w:rPr>
@@ -947,10 +886,7 @@
         <w:br/>
       </w:r>
       <w:r>
-        <w:t>We hereby certify that all information submitted in this application and its annexes i</w:t>
-      </w:r>
-      <w:r>
-        <w:t xml:space="preserve">s true, accurate, and verifiable through the National Bank of Rwanda (BNR) credit registry and the Rwanda Cooperative </w:t>
+        <w:t xml:space="preserve">We hereby certify that all information submitted in this application and its annexes is true, accurate, and verifiable through the National Bank of Rwanda (BNR) credit registry and the Rwanda Cooperative </w:t>
       </w:r>
       <w:r>
         <w:lastRenderedPageBreak/>
@@ -995,10 +931,7 @@
             </w:r>
             <w:r>
               <w:br/>
-              <w:t xml:space="preserve">President, Koperative </w:t>
-            </w:r>
-            <w:r>
-              <w:t>Twitezimbere Gasabo</w:t>
+              <w:t>President, Koperative Twitezimbere Gasabo</w:t>
             </w:r>
             <w:r>
               <w:br/>
@@ -1553,10 +1486,6 @@
     <w:lsdException w:name="Book Title" w:uiPriority="33" w:qFormat="1"/>
     <w:lsdException w:name="Bibliography" w:semiHidden="1" w:uiPriority="37" w:unhideWhenUsed="1"/>
     <w:lsdException w:name="TOC Heading" w:semiHidden="1" w:uiPriority="39" w:unhideWhenUsed="1" w:qFormat="1"/>
-    <w:lsdException w:name="Grid Table Light" w:semiHidden="1" w:unhideWhenUsed="1"/>
-    <w:lsdException w:name="Grid Table 1 Light" w:semiHidden="1" w:unhideWhenUsed="1"/>
-    <w:lsdException w:name="Grid Table 2" w:semiHidden="1" w:unhideWhenUsed="1"/>
-    <w:lsdException w:name="Grid Table 3" w:semiHidden="1" w:unhideWhenUsed="1"/>
     <w:lsdException w:name="Grid Table 4" w:uiPriority="49"/>
     <w:lsdException w:name="Grid Table 5 Dark" w:uiPriority="50"/>
     <w:lsdException w:name="Grid Table 6 Colorful" w:uiPriority="51"/>
@@ -1874,6 +1803,7 @@
   <w:style w:type="character" w:default="1" w:styleId="DefaultParagraphFont">
     <w:name w:val="Default Paragraph Font"/>
     <w:uiPriority w:val="1"/>
+    <w:semiHidden/>
     <w:unhideWhenUsed/>
   </w:style>
   <w:style w:type="table" w:default="1" w:styleId="TableNormal">
@@ -12978,7 +12908,7 @@
 </file>
 
 <file path=customXml/itemProps1.xml><?xml version="1.0" encoding="utf-8"?>
-<ds:datastoreItem xmlns:ds="http://schemas.openxmlformats.org/officeDocument/2006/customXml" ds:itemID="{3C045E9B-AEB7-4F23-91B9-3219BD72B856}">
+<ds:datastoreItem xmlns:ds="http://schemas.openxmlformats.org/officeDocument/2006/customXml" ds:itemID="{53443B11-D982-4A00-AFB9-E7DD2A8346B2}">
   <ds:schemaRefs>
     <ds:schemaRef ds:uri="http://schemas.openxmlformats.org/officeDocument/2006/bibliography"/>
   </ds:schemaRefs>

</xml_diff>

<commit_message>
feat: implement document classification and extraction logic with AI integration, update schemas, and enhance error handling for off-topic documents
</commit_message>
<xml_diff>
--- a/documents/loan_application_twitezimbere_gasabo.docx
+++ b/documents/loan_application_twitezimbere_gasabo.docx
@@ -379,7 +379,15 @@
               <w:rPr>
                 <w:sz w:val="19"/>
               </w:rPr>
-              <w:t>10</w:t>
+              <w:t>2</w:t>
+            </w:r>
+            <w:bookmarkStart w:id="0" w:name="_GoBack"/>
+            <w:bookmarkEnd w:id="0"/>
+            <w:r>
+              <w:rPr>
+                <w:sz w:val="19"/>
+              </w:rPr>
+              <w:t>0</w:t>
             </w:r>
             <w:r>
               <w:rPr>
@@ -399,8 +407,6 @@
               </w:rPr>
               <w:t>Ten</w:t>
             </w:r>
-            <w:bookmarkStart w:id="0" w:name="_GoBack"/>
-            <w:bookmarkEnd w:id="0"/>
             <w:r>
               <w:rPr>
                 <w:sz w:val="19"/>
@@ -12908,7 +12914,7 @@
 </file>
 
 <file path=customXml/itemProps1.xml><?xml version="1.0" encoding="utf-8"?>
-<ds:datastoreItem xmlns:ds="http://schemas.openxmlformats.org/officeDocument/2006/customXml" ds:itemID="{53443B11-D982-4A00-AFB9-E7DD2A8346B2}">
+<ds:datastoreItem xmlns:ds="http://schemas.openxmlformats.org/officeDocument/2006/customXml" ds:itemID="{53CFE391-3902-4AC9-9B8B-1BBBE730C469}">
   <ds:schemaRefs>
     <ds:schemaRef ds:uri="http://schemas.openxmlformats.org/officeDocument/2006/bibliography"/>
   </ds:schemaRefs>

</xml_diff>